<commit_message>
Refresh unbranded retrieval templates and link readable research summaries
</commit_message>
<xml_diff>
--- a/public/retrieval-brain-dump-template.docx
+++ b/public/retrieval-brain-dump-template.docx
@@ -7,7 +7,7 @@
         <w:pStyle w:val="Title"/>
       </w:pPr>
       <w:r>
-        <w:t>Brain dump template</w:t>
+        <w:t>Brain dump</w:t>
       </w:r>
     </w:p>
     <w:p>
@@ -15,14 +15,76 @@
         <w:t>Topic [Add your taught topic]     Name __________________     Date __________</w:t>
       </w:r>
     </w:p>
+    <w:tbl>
+      <w:tblPr>
+        <w:tblW w:type="auto" w:w="0"/>
+        <w:tblLook w:firstColumn="1" w:firstRow="1" w:lastColumn="0" w:lastRow="0" w:noHBand="0" w:noVBand="1" w:val="04A0"/>
+      </w:tblPr>
+      <w:tblGrid>
+        <w:gridCol w:w="3456"/>
+        <w:gridCol w:w="3456"/>
+        <w:gridCol w:w="3456"/>
+      </w:tblGrid>
+      <w:tr>
+        <w:tc>
+          <w:tcPr>
+            <w:tcW w:type="dxa" w:w="3456"/>
+            <w:shd w:fill="E7EEF0"/>
+          </w:tcPr>
+          <w:p>
+            <w:pPr>
+              <w:spacing w:before="120" w:after="120"/>
+            </w:pPr>
+            <w:r>
+              <w:rPr>
+                <w:b/>
+                <w:sz w:val="20"/>
+              </w:rPr>
+              <w:t>01  RECALL</w:t>
+            </w:r>
+          </w:p>
+        </w:tc>
+        <w:tc>
+          <w:tcPr>
+            <w:tcW w:type="dxa" w:w="3456"/>
+            <w:shd w:fill="E7EEF0"/>
+          </w:tcPr>
+          <w:p>
+            <w:pPr>
+              <w:spacing w:before="120" w:after="120"/>
+            </w:pPr>
+            <w:r>
+              <w:rPr>
+                <w:b/>
+                <w:sz w:val="20"/>
+              </w:rPr>
+              <w:t>02  CHECK</w:t>
+            </w:r>
+          </w:p>
+        </w:tc>
+        <w:tc>
+          <w:tcPr>
+            <w:tcW w:type="dxa" w:w="3456"/>
+            <w:shd w:fill="E7EEF0"/>
+          </w:tcPr>
+          <w:p>
+            <w:pPr>
+              <w:spacing w:before="120" w:after="120"/>
+            </w:pPr>
+            <w:r>
+              <w:rPr>
+                <w:b/>
+                <w:sz w:val="20"/>
+              </w:rPr>
+              <w:t>03  IMPROVE</w:t>
+            </w:r>
+          </w:p>
+        </w:tc>
+      </w:tr>
+    </w:tbl>
     <w:p>
       <w:r>
-        <w:t>Teacher setup: Replace the bracketed prompts with your own content before printing. Keep checked answers ready for feedback.</w:t>
-      </w:r>
-    </w:p>
-    <w:p>
-      <w:r>
-        <w:t>Student routine: Recall without notes first. Then check and improve in a different colour.</w:t>
+        <w:t>Start with what you remember. Add corrections after feedback.</w:t>
       </w:r>
     </w:p>
     <w:tbl>
@@ -55,16 +117,30 @@
               <w:bottom w:w="120" w:type="dxa"/>
               <w:right w:w="120" w:type="dxa"/>
             </w:tcMar>
+            <w:shd w:fill="F3F6F5"/>
           </w:tcPr>
+          <w:p>
+            <w:pPr>
+              <w:spacing w:after="160"/>
+            </w:pPr>
+            <w:r>
+              <w:rPr>
+                <w:b/>
+                <w:sz w:val="26"/>
+              </w:rPr>
+              <w:t>What can you remember</w:t>
+            </w:r>
+          </w:p>
           <w:p>
             <w:r>
               <w:rPr>
-                <w:b/>
+                <w:color w:val="656B69"/>
+                <w:sz w:val="20"/>
               </w:rPr>
-              <w:t>[Add a recall focus]</w:t>
+              <w:t>[Your recall focus]</w:t>
               <w:br/>
               <w:br/>
-              <w:t>Write or sketch remembered knowledge.</w:t>
+              <w:t>Write, sketch and connect ideas.</w:t>
             </w:r>
           </w:p>
         </w:tc>
@@ -76,38 +152,10 @@
         <w:spacing w:after="100"/>
       </w:pPr>
       <w:r>
-        <w:t>My correction or next revisit ______________________________________________</w:t>
+        <w:t>Check and improve</w:t>
+        <w:br/>
+        <w:t>One idea to correct or revisit __________________________________________</w:t>
       </w:r>
-    </w:p>
-    <w:p>
-      <w:r>
-        <w:rPr>
-          <w:sz w:val="18"/>
-        </w:rPr>
-        <w:t>Teacher check: Sample explanations as well as keywords. Ask students to retrieve a corrected idea again later.</w:t>
-      </w:r>
-    </w:p>
-    <w:p>
-      <w:hyperlink r:id="rId10">
-        <w:r>
-          <w:rPr>
-            <w:u w:val="single"/>
-            <w:sz w:val="18"/>
-          </w:rPr>
-          <w:t>Credit and source: Pooja K. Agarwal — classroom guidance</w:t>
-        </w:r>
-      </w:hyperlink>
-    </w:p>
-    <w:p>
-      <w:hyperlink r:id="rId11">
-        <w:r>
-          <w:rPr>
-            <w:u w:val="single"/>
-            <w:sz w:val="18"/>
-          </w:rPr>
-          <w:t>Full activity guide</w:t>
-        </w:r>
-      </w:hyperlink>
     </w:p>
     <w:sectPr>
       <w:footerReference w:type="default" r:id="rId9"/>
@@ -130,7 +178,7 @@
       <w:rPr>
         <w:sz w:val="18"/>
       </w:rPr>
-      <w:t>TNT Teaching Tools   |   Recall independently   |   Check and improve</w:t>
+      <w:t>Recall from memory first. Check and improve in a different colour.</w:t>
     </w:r>
   </w:p>
 </w:ftr>
@@ -503,7 +551,7 @@
       <w:spacing w:after="120"/>
     </w:pPr>
     <w:rPr>
-      <w:rFonts w:ascii="Arial" w:hAnsi="Arial"/>
+      <w:rFonts w:ascii="Calibri" w:hAnsi="Calibri"/>
       <w:color w:val="000000"/>
       <w:sz w:val="22"/>
     </w:rPr>
@@ -567,7 +615,7 @@
       <w:outlineLvl w:val="0"/>
     </w:pPr>
     <w:rPr>
-      <w:rFonts w:asciiTheme="majorHAnsi" w:eastAsiaTheme="majorEastAsia" w:hAnsiTheme="majorHAnsi" w:cstheme="majorBidi" w:ascii="Arial" w:hAnsi="Arial"/>
+      <w:rFonts w:asciiTheme="majorHAnsi" w:eastAsiaTheme="majorEastAsia" w:hAnsiTheme="majorHAnsi" w:cstheme="majorBidi" w:ascii="Calibri" w:hAnsi="Calibri"/>
       <w:b/>
       <w:bCs/>
       <w:color w:val="000000"/>
@@ -591,7 +639,7 @@
       <w:outlineLvl w:val="1"/>
     </w:pPr>
     <w:rPr>
-      <w:rFonts w:asciiTheme="majorHAnsi" w:eastAsiaTheme="majorEastAsia" w:hAnsiTheme="majorHAnsi" w:cstheme="majorBidi" w:ascii="Arial" w:hAnsi="Arial"/>
+      <w:rFonts w:asciiTheme="majorHAnsi" w:eastAsiaTheme="majorEastAsia" w:hAnsiTheme="majorHAnsi" w:cstheme="majorBidi" w:ascii="Calibri" w:hAnsi="Calibri"/>
       <w:b/>
       <w:bCs/>
       <w:color w:val="000000"/>
@@ -853,11 +901,11 @@
       <w:contextualSpacing/>
     </w:pPr>
     <w:rPr>
-      <w:rFonts w:asciiTheme="majorHAnsi" w:eastAsiaTheme="majorEastAsia" w:hAnsiTheme="majorHAnsi" w:cstheme="majorBidi" w:ascii="Arial" w:hAnsi="Arial"/>
+      <w:rFonts w:asciiTheme="majorHAnsi" w:eastAsiaTheme="majorEastAsia" w:hAnsiTheme="majorHAnsi" w:cstheme="majorBidi" w:ascii="Calibri" w:hAnsi="Calibri"/>
       <w:color w:val="000000"/>
       <w:spacing w:val="5"/>
       <w:kern w:val="28"/>
-      <w:sz w:val="50"/>
+      <w:sz w:val="56"/>
       <w:szCs w:val="52"/>
     </w:rPr>
   </w:style>

</xml_diff>